<commit_message>
minor doc updates for device code
</commit_message>
<xml_diff>
--- a/docs/VDJ User Manual.docx
+++ b/docs/VDJ User Manual.docx
@@ -1472,19 +1472,7 @@
           <w:rPr>
             <w:rStyle w:val="Hyperlink"/>
           </w:rPr>
-          <w:t>details to get you</w:t>
-        </w:r>
-        <w:r>
-          <w:rPr>
-            <w:rStyle w:val="Hyperlink"/>
-          </w:rPr>
-          <w:t xml:space="preserve"> </w:t>
-        </w:r>
-        <w:r>
-          <w:rPr>
-            <w:rStyle w:val="Hyperlink"/>
-          </w:rPr>
-          <w:t>started can be found here</w:t>
+          <w:t>details to get you started can be found here</w:t>
         </w:r>
       </w:hyperlink>
       <w:r>
@@ -1642,15 +1630,7 @@
     </w:p>
     <w:p>
       <w:r>
-        <w:t>On initial login, no context is “active</w:t>
-      </w:r>
-      <w:proofErr w:type="gramStart"/>
-      <w:r>
-        <w:t>”</w:t>
-      </w:r>
-      <w:proofErr w:type="gramEnd"/>
-      <w:r>
-        <w:t xml:space="preserve"> and the screen will appear like this:</w:t>
+        <w:t>On initial login, no context is “active” and the screen will appear like this:</w:t>
       </w:r>
     </w:p>
     <w:p>
@@ -2038,7 +2018,7 @@
         </w:rPr>
         <w:lastRenderedPageBreak/>
         <w:drawing>
-          <wp:inline distT="0" distB="0" distL="0" distR="0" wp14:anchorId="364D78F4" wp14:editId="7F69C841">
+          <wp:inline distT="0" distB="0" distL="0" distR="0" wp14:anchorId="364D78F4" wp14:editId="54E7B3C9">
             <wp:extent cx="5912640" cy="3377868"/>
             <wp:effectExtent l="0" t="0" r="0" b="0"/>
             <wp:docPr id="504067564" name="Picture 1"/>
@@ -2244,10 +2224,22 @@
         <w:t>Begin</w:t>
       </w:r>
       <w:r>
-        <w:t xml:space="preserve"> an import by clicking the “Import” button and entering </w:t>
-      </w:r>
-      <w:r>
-        <w:t xml:space="preserve">login information (if necessary) and </w:t>
+        <w:t xml:space="preserve"> an import by clicking the “Import” button</w:t>
+      </w:r>
+      <w:r>
+        <w:t xml:space="preserve">, following the login instructions </w:t>
+      </w:r>
+      <w:r>
+        <w:t>(if necessary</w:t>
+      </w:r>
+      <w:r>
+        <w:t>),</w:t>
+      </w:r>
+      <w:r>
+        <w:t xml:space="preserve"> and </w:t>
+      </w:r>
+      <w:r>
+        <w:t xml:space="preserve">providing </w:t>
       </w:r>
       <w:r>
         <w:t>a search string. The search is case-insensitive and searches with</w:t>
@@ -3732,7 +3724,7 @@
           <w:noProof/>
         </w:rPr>
         <w:drawing>
-          <wp:inline distT="0" distB="0" distL="0" distR="0" wp14:anchorId="38BE0AFA" wp14:editId="28106121">
+          <wp:inline distT="0" distB="0" distL="0" distR="0" wp14:anchorId="38BE0AFA" wp14:editId="5E35E6E4">
             <wp:extent cx="5542915" cy="3705816"/>
             <wp:effectExtent l="0" t="0" r="635" b="9525"/>
             <wp:docPr id="1674213349" name="Picture 3"/>
@@ -3918,7 +3910,7 @@
           <w:noProof/>
         </w:rPr>
         <w:drawing>
-          <wp:inline distT="0" distB="0" distL="0" distR="0" wp14:anchorId="1651D8E3" wp14:editId="41E10505">
+          <wp:inline distT="0" distB="0" distL="0" distR="0" wp14:anchorId="1651D8E3" wp14:editId="154048CF">
             <wp:extent cx="5699868" cy="3030640"/>
             <wp:effectExtent l="0" t="0" r="0" b="0"/>
             <wp:docPr id="1552304897" name="Picture 2"/>
@@ -6074,6 +6066,7 @@
   <w:style w:type="character" w:default="1" w:styleId="DefaultParagraphFont">
     <w:name w:val="Default Paragraph Font"/>
     <w:uiPriority w:val="1"/>
+    <w:semiHidden/>
     <w:unhideWhenUsed/>
   </w:style>
   <w:style w:type="table" w:default="1" w:styleId="TableNormal">

</xml_diff>